<commit_message>
Added Abstract in the research paper
</commit_message>
<xml_diff>
--- a/source/Documentation_Team_Untitled/Team_Untitled _Research_paper.docx
+++ b/source/Documentation_Team_Untitled/Team_Untitled _Research_paper.docx
@@ -18,79 +18,157 @@
       </w:r>
     </w:p>
     <w:p>
-      <w:r>
+      <w:pPr>
+        <w:pStyle w:val="Heading1"/>
+      </w:pPr>
+      <w:r>
+        <w:t>Investigate Input reconstruction by using Classifiers</w:t>
+      </w:r>
+      <w:r>
+        <w:t xml:space="preserve"> </w:t>
+      </w:r>
+    </w:p>
+    <w:p>
+      <w:pPr>
+        <w:jc w:val="both"/>
         <w:rPr>
-          <w:b/>
-          <w:bCs/>
+          <w:rStyle w:val="Strong"/>
         </w:rPr>
-        <w:t xml:space="preserve">Input Reconstruction Using Hierarchical Temporal Memory and K-Nearest </w:t>
-      </w:r>
-      <w:proofErr w:type="spellStart"/>
+      </w:pPr>
       <w:r>
         <w:rPr>
-          <w:b/>
-          <w:bCs/>
-        </w:rPr>
-        <w:t>Neighbors</w:t>
-      </w:r>
-      <w:proofErr w:type="spellEnd"/>
-      <w:r>
-        <w:rPr>
-          <w:b/>
-          <w:bCs/>
-        </w:rPr>
-        <w:t xml:space="preserve"> Classifiers: A Comparative Study</w:t>
-      </w:r>
-    </w:p>
-    <w:p>
-      <w:r>
-        <w:pict w14:anchorId="2FE2FA86">
-          <v:rect id="_x0000_i1079" style="width:0;height:.75pt" o:hralign="center" o:hrstd="t" o:hrnoshade="t" o:hr="t" fillcolor="#f8faff" stroked="f"/>
-        </w:pict>
-      </w:r>
-    </w:p>
-    <w:p>
-      <w:pPr>
-        <w:rPr>
-          <w:b/>
-          <w:bCs/>
-        </w:rPr>
-      </w:pPr>
-      <w:r>
-        <w:rPr>
-          <w:b/>
-          <w:bCs/>
+          <w:rStyle w:val="Strong"/>
         </w:rPr>
         <w:t>Abstract</w:t>
       </w:r>
     </w:p>
     <w:p>
-      <w:r>
-        <w:t xml:space="preserve">Provide a concise summary of the research, including the problem statement, methodology, key findings, and conclusions. Highlight the use of </w:t>
+      <w:pPr>
+        <w:pStyle w:val="ListParagraph"/>
+        <w:jc w:val="both"/>
+      </w:pPr>
+      <w:r>
+        <w:t xml:space="preserve">Input reconstruction plays a crucial role in neural encoding and pattern recognition, allowing for efficient data processing and predictive </w:t>
       </w:r>
       <w:proofErr w:type="spellStart"/>
       <w:r>
-        <w:t>HTMClassifier</w:t>
+        <w:t>modeling</w:t>
       </w:r>
       <w:proofErr w:type="spellEnd"/>
       <w:r>
-        <w:t xml:space="preserve"> and </w:t>
+        <w:t xml:space="preserve">. This study investigates the use of Hierarchical Temporal Memory (HTM) and K-Nearest </w:t>
       </w:r>
       <w:proofErr w:type="spellStart"/>
       <w:r>
-        <w:t>KNNClassifier</w:t>
+        <w:t>Neighbors</w:t>
       </w:r>
       <w:proofErr w:type="spellEnd"/>
       <w:r>
-        <w:t xml:space="preserve"> for input reconstruction and the comparative analysis of their performance.</w:t>
-      </w:r>
-    </w:p>
-    <w:p>
+        <w:t xml:space="preserve"> (KNN) classifiers for reconstructing encoded inputs. We begin by encoding an input array using the default settings from the </w:t>
+      </w:r>
+      <w:proofErr w:type="spellStart"/>
+      <w:r>
+        <w:t>NeocortexAPI</w:t>
+      </w:r>
+      <w:proofErr w:type="spellEnd"/>
+      <w:r>
+        <w:t xml:space="preserve"> repository and training a spatial pooler to generate high-quality Sparse Distributed Representations (SDRs). The dataset is randomized and split into 80% for training and 20% for testing. The HTM and KNN classifiers are trained on the first 80%, while the remaining 20% is used for evaluation. The encoded test data is passed through the classifiers for decoding, and the reconstructed values are compared against the original input using two similarity metrics: internal similarity, which measures alignment between classifier-predicted values and encoded representations, and percentage similarity, which quantifies the accuracy of reconstruction relative to the original input. The results, visualized using the </w:t>
+      </w:r>
+      <w:proofErr w:type="spellStart"/>
+      <w:r>
+        <w:t>ScottPlot</w:t>
+      </w:r>
+      <w:proofErr w:type="spellEnd"/>
+      <w:r>
+        <w:t xml:space="preserve"> library in .NET, demonstrate that both classifiers effectively reconstruct input patterns with high accuracy. This research highlights the potential of HTM and KNN in sparse encoding-based input reconstruction, with applications in anomaly detection, data compression, and predictive </w:t>
+      </w:r>
+      <w:proofErr w:type="spellStart"/>
+      <w:r>
+        <w:t>modeling</w:t>
+      </w:r>
+      <w:proofErr w:type="spellEnd"/>
+      <w:r>
+        <w:t>. Our findings contribute to the advancement of machine learning techniques that leverage sparse distributed representations for improved classification and reconstruction accuracy.</w:t>
+      </w:r>
+    </w:p>
+    <w:p>
+      <w:pPr>
+        <w:pStyle w:val="ListParagraph"/>
+        <w:jc w:val="both"/>
+        <w:sectPr>
+          <w:pgSz w:w="11906" w:h="16838"/>
+          <w:pgMar w:top="1440" w:right="1440" w:bottom="1440" w:left="1440" w:header="708" w:footer="708" w:gutter="0"/>
+          <w:cols w:space="708"/>
+          <w:docGrid w:linePitch="360"/>
+        </w:sectPr>
+      </w:pPr>
+      <w:r>
+        <w:t>Keywords</w:t>
+      </w:r>
+      <w:r>
+        <w:t xml:space="preserve">: </w:t>
+      </w:r>
+      <w:r>
+        <w:t xml:space="preserve">Hierarchical Temporal </w:t>
+      </w:r>
+      <w:proofErr w:type="gramStart"/>
+      <w:r>
+        <w:t>Memory(</w:t>
+      </w:r>
+      <w:proofErr w:type="gramEnd"/>
+      <w:r>
+        <w:t>HTM)</w:t>
+      </w:r>
+      <w:r>
+        <w:t xml:space="preserve">, </w:t>
+      </w:r>
+      <w:r>
+        <w:t>K-Nearest</w:t>
+      </w:r>
+      <w:r>
+        <w:t xml:space="preserve"> </w:t>
+      </w:r>
+      <w:proofErr w:type="spellStart"/>
+      <w:r>
+        <w:t>Neighbors</w:t>
+      </w:r>
+      <w:proofErr w:type="spellEnd"/>
+      <w:r>
+        <w:t>(KNN)</w:t>
+      </w:r>
+      <w:r>
+        <w:t xml:space="preserve">, Input Reconstruction, Sparse Distributed Representations, Neural Encoding, Pattern Recognition, Machine Learning, Classifiers, Anomaly Detection, Predictive </w:t>
+      </w:r>
+      <w:proofErr w:type="spellStart"/>
+      <w:r>
+        <w:t>Modeling</w:t>
+      </w:r>
+      <w:proofErr w:type="spellEnd"/>
+      <w:r>
+        <w:t>.</w:t>
+      </w:r>
+    </w:p>
+    <w:p>
+      <w:pPr>
+        <w:jc w:val="both"/>
+        <w:sectPr>
+          <w:type w:val="continuous"/>
+          <w:pgSz w:w="11906" w:h="16838"/>
+          <w:pgMar w:top="1440" w:right="1440" w:bottom="1440" w:left="1440" w:header="708" w:footer="708" w:gutter="0"/>
+          <w:cols w:num="2" w:space="708"/>
+          <w:docGrid w:linePitch="360"/>
+        </w:sectPr>
+      </w:pPr>
       <w:r>
         <w:pict w14:anchorId="31B1A240">
-          <v:rect id="_x0000_i1080" style="width:0;height:.75pt" o:hralign="center" o:hrstd="t" o:hrnoshade="t" o:hr="t" fillcolor="#f8faff" stroked="f"/>
+          <v:rect id="_x0000_i1073" style="width:0;height:.75pt" o:hralign="center" o:hrstd="t" o:hrnoshade="t" o:hr="t" fillcolor="#f8faff" stroked="f"/>
         </w:pict>
       </w:r>
+    </w:p>
+    <w:p>
+      <w:pPr>
+        <w:jc w:val="both"/>
+      </w:pPr>
     </w:p>
     <w:p>
       <w:pPr>
@@ -229,6 +307,7 @@
         </w:numPr>
       </w:pPr>
       <w:r>
+        <w:lastRenderedPageBreak/>
         <w:t xml:space="preserve">Compare the performance of </w:t>
       </w:r>
       <w:proofErr w:type="spellStart"/>
@@ -291,7 +370,7 @@
     <w:p>
       <w:r>
         <w:pict w14:anchorId="06AA343D">
-          <v:rect id="_x0000_i1081" style="width:0;height:.75pt" o:hralign="center" o:hrstd="t" o:hrnoshade="t" o:hr="t" fillcolor="#f8faff" stroked="f"/>
+          <v:rect id="_x0000_i1074" style="width:0;height:.75pt" o:hralign="center" o:hrstd="t" o:hrnoshade="t" o:hr="t" fillcolor="#f8faff" stroked="f"/>
         </w:pict>
       </w:r>
     </w:p>
@@ -362,7 +441,7 @@
     <w:p>
       <w:r>
         <w:pict w14:anchorId="4AA2CA79">
-          <v:rect id="_x0000_i1082" style="width:0;height:.75pt" o:hralign="center" o:hrstd="t" o:hrnoshade="t" o:hr="t" fillcolor="#f8faff" stroked="f"/>
+          <v:rect id="_x0000_i1075" style="width:0;height:.75pt" o:hralign="center" o:hrstd="t" o:hrnoshade="t" o:hr="t" fillcolor="#f8faff" stroked="f"/>
         </w:pict>
       </w:r>
     </w:p>
@@ -393,7 +472,6 @@
           <w:b/>
           <w:bCs/>
         </w:rPr>
-        <w:lastRenderedPageBreak/>
         <w:t>3.1. System Architecture</w:t>
       </w:r>
     </w:p>
@@ -658,8 +736,9 @@
     </w:p>
     <w:p>
       <w:r>
+        <w:lastRenderedPageBreak/>
         <w:pict w14:anchorId="623E5447">
-          <v:rect id="_x0000_i1083" style="width:0;height:.75pt" o:hralign="center" o:hrstd="t" o:hrnoshade="t" o:hr="t" fillcolor="#f8faff" stroked="f"/>
+          <v:rect id="_x0000_i1076" style="width:0;height:.75pt" o:hralign="center" o:hrstd="t" o:hrnoshade="t" o:hr="t" fillcolor="#f8faff" stroked="f"/>
         </w:pict>
       </w:r>
     </w:p>
@@ -784,7 +863,7 @@
     <w:p>
       <w:r>
         <w:pict w14:anchorId="0C341D36">
-          <v:rect id="_x0000_i1084" style="width:0;height:.75pt" o:hralign="center" o:hrstd="t" o:hrnoshade="t" o:hr="t" fillcolor="#f8faff" stroked="f"/>
+          <v:rect id="_x0000_i1077" style="width:0;height:.75pt" o:hralign="center" o:hrstd="t" o:hrnoshade="t" o:hr="t" fillcolor="#f8faff" stroked="f"/>
         </w:pict>
       </w:r>
     </w:p>
@@ -829,7 +908,6 @@
         </w:numPr>
       </w:pPr>
       <w:r>
-        <w:lastRenderedPageBreak/>
         <w:t xml:space="preserve">Present the results of input reconstruction for both </w:t>
       </w:r>
       <w:proofErr w:type="spellStart"/>
@@ -986,7 +1064,7 @@
     <w:p>
       <w:r>
         <w:pict w14:anchorId="465145EE">
-          <v:rect id="_x0000_i1085" style="width:0;height:.75pt" o:hralign="center" o:hrstd="t" o:hrnoshade="t" o:hr="t" fillcolor="#f8faff" stroked="f"/>
+          <v:rect id="_x0000_i1078" style="width:0;height:.75pt" o:hralign="center" o:hrstd="t" o:hrnoshade="t" o:hr="t" fillcolor="#f8faff" stroked="f"/>
         </w:pict>
       </w:r>
     </w:p>
@@ -1082,6 +1160,7 @@
         </w:numPr>
       </w:pPr>
       <w:r>
+        <w:lastRenderedPageBreak/>
         <w:t>Exploring other classifiers or hybrid approaches.</w:t>
       </w:r>
     </w:p>
@@ -1110,7 +1189,7 @@
     <w:p>
       <w:r>
         <w:pict w14:anchorId="36F4A6D6">
-          <v:rect id="_x0000_i1086" style="width:0;height:.75pt" o:hralign="center" o:hrstd="t" o:hrnoshade="t" o:hr="t" fillcolor="#f8faff" stroked="f"/>
+          <v:rect id="_x0000_i1079" style="width:0;height:.75pt" o:hralign="center" o:hrstd="t" o:hrnoshade="t" o:hr="t" fillcolor="#f8faff" stroked="f"/>
         </w:pict>
       </w:r>
     </w:p>
@@ -1131,19 +1210,55 @@
     </w:p>
     <w:p>
       <w:pPr>
+        <w:pStyle w:val="ListParagraph"/>
         <w:numPr>
           <w:ilvl w:val="0"/>
-          <w:numId w:val="11"/>
-        </w:numPr>
-      </w:pPr>
-      <w:r>
-        <w:t>List all the academic papers, books, and online resources cited in your research paper. Use a consistent citation style (e.g., APA, IEEE).</w:t>
-      </w:r>
-    </w:p>
-    <w:p>
+          <w:numId w:val="13"/>
+        </w:numPr>
+      </w:pPr>
+      <w:r>
+        <w:rPr>
+          <w:b/>
+          <w:bCs/>
+        </w:rPr>
+        <w:t>Hawkins, J., Ahmad, S., &amp; Cui, Y. (2017).</w:t>
+      </w:r>
+      <w:r>
+        <w:t xml:space="preserve"> A theory of how columns in the neocortex enable learning the structure of the world. </w:t>
+      </w:r>
+      <w:r>
+        <w:rPr>
+          <w:i/>
+          <w:iCs/>
+        </w:rPr>
+        <w:t>Frontiers in Neural Circuits, 11</w:t>
+      </w:r>
+      <w:r>
+        <w:t xml:space="preserve">, 81. </w:t>
+      </w:r>
+      <w:hyperlink r:id="rId5" w:history="1">
+        <w:r>
+          <w:rPr>
+            <w:rStyle w:val="Hyperlink"/>
+          </w:rPr>
+          <w:t>https://www.frontiersin.org/articles/10.3389</w:t>
+        </w:r>
+        <w:r>
+          <w:rPr>
+            <w:rStyle w:val="Hyperlink"/>
+          </w:rPr>
+          <w:t>/</w:t>
+        </w:r>
+        <w:r>
+          <w:rPr>
+            <w:rStyle w:val="Hyperlink"/>
+          </w:rPr>
+          <w:t>fncir.2017.00081/full</w:t>
+        </w:r>
+      </w:hyperlink>
       <w:r>
         <w:pict w14:anchorId="62B11E61">
-          <v:rect id="_x0000_i1087" style="width:0;height:.75pt" o:hralign="center" o:hrstd="t" o:hrnoshade="t" o:hr="t" fillcolor="#f8faff" stroked="f"/>
+          <v:rect id="_x0000_i1080" style="width:0;height:.75pt" o:hralign="center" o:hrstd="t" o:hrnoshade="t" o:hr="t" fillcolor="#f8faff" stroked="f"/>
         </w:pict>
       </w:r>
     </w:p>
@@ -1214,12 +1329,12 @@
         </w:numPr>
       </w:pPr>
       <w:r>
-        <w:lastRenderedPageBreak/>
         <w:t>Additional graphs or charts.</w:t>
       </w:r>
     </w:p>
     <w:p/>
     <w:sectPr>
+      <w:type w:val="continuous"/>
       <w:pgSz w:w="11906" w:h="16838"/>
       <w:pgMar w:top="1440" w:right="1440" w:bottom="1440" w:left="1440" w:header="708" w:footer="708" w:gutter="0"/>
       <w:cols w:space="708"/>
@@ -2871,6 +2986,119 @@
     </w:lvl>
   </w:abstractNum>
   <w:abstractNum w:abstractNumId="11" w15:restartNumberingAfterBreak="0">
+    <w:nsid w:val="6CA374B8"/>
+    <w:multiLevelType w:val="hybridMultilevel"/>
+    <w:tmpl w:val="25A2FD02"/>
+    <w:lvl w:ilvl="0" w:tplc="40090001">
+      <w:start w:val="1"/>
+      <w:numFmt w:val="bullet"/>
+      <w:lvlText w:val=""/>
+      <w:lvlJc w:val="left"/>
+      <w:pPr>
+        <w:ind w:left="720" w:hanging="360"/>
+      </w:pPr>
+      <w:rPr>
+        <w:rFonts w:ascii="Symbol" w:hAnsi="Symbol" w:hint="default"/>
+      </w:rPr>
+    </w:lvl>
+    <w:lvl w:ilvl="1" w:tplc="40090003" w:tentative="1">
+      <w:start w:val="1"/>
+      <w:numFmt w:val="bullet"/>
+      <w:lvlText w:val="o"/>
+      <w:lvlJc w:val="left"/>
+      <w:pPr>
+        <w:ind w:left="1440" w:hanging="360"/>
+      </w:pPr>
+      <w:rPr>
+        <w:rFonts w:ascii="Courier New" w:hAnsi="Courier New" w:cs="Courier New" w:hint="default"/>
+      </w:rPr>
+    </w:lvl>
+    <w:lvl w:ilvl="2" w:tplc="40090005" w:tentative="1">
+      <w:start w:val="1"/>
+      <w:numFmt w:val="bullet"/>
+      <w:lvlText w:val=""/>
+      <w:lvlJc w:val="left"/>
+      <w:pPr>
+        <w:ind w:left="2160" w:hanging="360"/>
+      </w:pPr>
+      <w:rPr>
+        <w:rFonts w:ascii="Wingdings" w:hAnsi="Wingdings" w:hint="default"/>
+      </w:rPr>
+    </w:lvl>
+    <w:lvl w:ilvl="3" w:tplc="40090001" w:tentative="1">
+      <w:start w:val="1"/>
+      <w:numFmt w:val="bullet"/>
+      <w:lvlText w:val=""/>
+      <w:lvlJc w:val="left"/>
+      <w:pPr>
+        <w:ind w:left="2880" w:hanging="360"/>
+      </w:pPr>
+      <w:rPr>
+        <w:rFonts w:ascii="Symbol" w:hAnsi="Symbol" w:hint="default"/>
+      </w:rPr>
+    </w:lvl>
+    <w:lvl w:ilvl="4" w:tplc="40090003" w:tentative="1">
+      <w:start w:val="1"/>
+      <w:numFmt w:val="bullet"/>
+      <w:lvlText w:val="o"/>
+      <w:lvlJc w:val="left"/>
+      <w:pPr>
+        <w:ind w:left="3600" w:hanging="360"/>
+      </w:pPr>
+      <w:rPr>
+        <w:rFonts w:ascii="Courier New" w:hAnsi="Courier New" w:cs="Courier New" w:hint="default"/>
+      </w:rPr>
+    </w:lvl>
+    <w:lvl w:ilvl="5" w:tplc="40090005" w:tentative="1">
+      <w:start w:val="1"/>
+      <w:numFmt w:val="bullet"/>
+      <w:lvlText w:val=""/>
+      <w:lvlJc w:val="left"/>
+      <w:pPr>
+        <w:ind w:left="4320" w:hanging="360"/>
+      </w:pPr>
+      <w:rPr>
+        <w:rFonts w:ascii="Wingdings" w:hAnsi="Wingdings" w:hint="default"/>
+      </w:rPr>
+    </w:lvl>
+    <w:lvl w:ilvl="6" w:tplc="40090001" w:tentative="1">
+      <w:start w:val="1"/>
+      <w:numFmt w:val="bullet"/>
+      <w:lvlText w:val=""/>
+      <w:lvlJc w:val="left"/>
+      <w:pPr>
+        <w:ind w:left="5040" w:hanging="360"/>
+      </w:pPr>
+      <w:rPr>
+        <w:rFonts w:ascii="Symbol" w:hAnsi="Symbol" w:hint="default"/>
+      </w:rPr>
+    </w:lvl>
+    <w:lvl w:ilvl="7" w:tplc="40090003" w:tentative="1">
+      <w:start w:val="1"/>
+      <w:numFmt w:val="bullet"/>
+      <w:lvlText w:val="o"/>
+      <w:lvlJc w:val="left"/>
+      <w:pPr>
+        <w:ind w:left="5760" w:hanging="360"/>
+      </w:pPr>
+      <w:rPr>
+        <w:rFonts w:ascii="Courier New" w:hAnsi="Courier New" w:cs="Courier New" w:hint="default"/>
+      </w:rPr>
+    </w:lvl>
+    <w:lvl w:ilvl="8" w:tplc="40090005" w:tentative="1">
+      <w:start w:val="1"/>
+      <w:numFmt w:val="bullet"/>
+      <w:lvlText w:val=""/>
+      <w:lvlJc w:val="left"/>
+      <w:pPr>
+        <w:ind w:left="6480" w:hanging="360"/>
+      </w:pPr>
+      <w:rPr>
+        <w:rFonts w:ascii="Wingdings" w:hAnsi="Wingdings" w:hint="default"/>
+      </w:rPr>
+    </w:lvl>
+  </w:abstractNum>
+  <w:abstractNum w:abstractNumId="12" w15:restartNumberingAfterBreak="0">
     <w:nsid w:val="72AE5927"/>
     <w:multiLevelType w:val="multilevel"/>
     <w:tmpl w:val="F9969016"/>
@@ -3044,7 +3272,7 @@
     <w:abstractNumId w:val="6"/>
   </w:num>
   <w:num w:numId="9" w16cid:durableId="609974665">
-    <w:abstractNumId w:val="11"/>
+    <w:abstractNumId w:val="12"/>
   </w:num>
   <w:num w:numId="10" w16cid:durableId="1706515745">
     <w:abstractNumId w:val="9"/>
@@ -3054,6 +3282,9 @@
   </w:num>
   <w:num w:numId="12" w16cid:durableId="1841039011">
     <w:abstractNumId w:val="4"/>
+  </w:num>
+  <w:num w:numId="13" w16cid:durableId="451481556">
+    <w:abstractNumId w:val="11"/>
   </w:num>
 </w:numbering>
 </file>
@@ -3974,6 +4205,52 @@
       <w:spacing w:val="5"/>
     </w:rPr>
   </w:style>
+  <w:style w:type="character" w:styleId="Strong">
+    <w:name w:val="Strong"/>
+    <w:basedOn w:val="DefaultParagraphFont"/>
+    <w:uiPriority w:val="22"/>
+    <w:qFormat/>
+    <w:rsid w:val="006E158B"/>
+    <w:rPr>
+      <w:b/>
+      <w:bCs/>
+    </w:rPr>
+  </w:style>
+  <w:style w:type="character" w:styleId="Hyperlink">
+    <w:name w:val="Hyperlink"/>
+    <w:basedOn w:val="DefaultParagraphFont"/>
+    <w:uiPriority w:val="99"/>
+    <w:unhideWhenUsed/>
+    <w:rsid w:val="00D3099B"/>
+    <w:rPr>
+      <w:color w:val="0563C1" w:themeColor="hyperlink"/>
+      <w:u w:val="single"/>
+    </w:rPr>
+  </w:style>
+  <w:style w:type="character" w:styleId="UnresolvedMention">
+    <w:name w:val="Unresolved Mention"/>
+    <w:basedOn w:val="DefaultParagraphFont"/>
+    <w:uiPriority w:val="99"/>
+    <w:semiHidden/>
+    <w:unhideWhenUsed/>
+    <w:rsid w:val="00D3099B"/>
+    <w:rPr>
+      <w:color w:val="605E5C"/>
+      <w:shd w:val="clear" w:color="auto" w:fill="E1DFDD"/>
+    </w:rPr>
+  </w:style>
+  <w:style w:type="character" w:styleId="FollowedHyperlink">
+    <w:name w:val="FollowedHyperlink"/>
+    <w:basedOn w:val="DefaultParagraphFont"/>
+    <w:uiPriority w:val="99"/>
+    <w:semiHidden/>
+    <w:unhideWhenUsed/>
+    <w:rsid w:val="00D3099B"/>
+    <w:rPr>
+      <w:color w:val="954F72" w:themeColor="followedHyperlink"/>
+      <w:u w:val="single"/>
+    </w:rPr>
+  </w:style>
 </w:styles>
 </file>
 

</xml_diff>

<commit_message>
Added introduction in research paper
</commit_message>
<xml_diff>
--- a/source/Documentation_Team_Untitled/Team_Untitled _Research_paper.docx
+++ b/source/Documentation_Team_Untitled/Team_Untitled _Research_paper.docx
@@ -43,10 +43,6 @@
       </w:r>
     </w:p>
     <w:p>
-      <w:pPr>
-        <w:pStyle w:val="ListParagraph"/>
-        <w:jc w:val="both"/>
-      </w:pPr>
       <w:r>
         <w:t xml:space="preserve">Input reconstruction plays a crucial role in neural encoding and pattern recognition, allowing for efficient data processing and predictive </w:t>
       </w:r>
@@ -93,8 +89,6 @@
     </w:p>
     <w:p>
       <w:pPr>
-        <w:pStyle w:val="ListParagraph"/>
-        <w:jc w:val="both"/>
         <w:sectPr>
           <w:pgSz w:w="11906" w:h="16838"/>
           <w:pgMar w:top="1440" w:right="1440" w:bottom="1440" w:left="1440" w:header="708" w:footer="708" w:gutter="0"/>
@@ -144,9 +138,6 @@
         <w:t>Modeling</w:t>
       </w:r>
       <w:proofErr w:type="spellEnd"/>
-      <w:r>
-        <w:t>.</w:t>
-      </w:r>
     </w:p>
     <w:p>
       <w:pPr>
@@ -159,11 +150,6 @@
           <w:docGrid w:linePitch="360"/>
         </w:sectPr>
       </w:pPr>
-      <w:r>
-        <w:pict w14:anchorId="31B1A240">
-          <v:rect id="_x0000_i1073" style="width:0;height:.75pt" o:hralign="center" o:hrstd="t" o:hrnoshade="t" o:hr="t" fillcolor="#f8faff" stroked="f"/>
-        </w:pict>
-      </w:r>
     </w:p>
     <w:p>
       <w:pPr>
@@ -186,191 +172,131 @@
       </w:r>
     </w:p>
     <w:p>
+      <w:r>
+        <w:t xml:space="preserve">In the field of machine learning and artificial intelligence, input reconstruction is a fundamental challenge that involves recovering original data from encoded representations. It is widely used in applications such as anomaly detection, predictive </w:t>
+      </w:r>
+      <w:proofErr w:type="spellStart"/>
+      <w:r>
+        <w:t>modeling</w:t>
+      </w:r>
+      <w:proofErr w:type="spellEnd"/>
+      <w:r>
+        <w:t>, and data compression, where accurate reconstruction of input patterns is crucial for extracting meaningful insights. One of the key approaches to encoding data efficiently is the use of Sparse Distributed Representations (SDRs), a biologically inspired framework central to Hierarchical Temporal Memory (HTM). SDRs represent information in a sparse, high-dimensional format, making them robust to noise and well-suited for learning complex patterns [Hawkins, Ahmad, &amp; Cui, 2017].</w:t>
+      </w:r>
+    </w:p>
+    <w:p>
+      <w:r>
+        <w:t xml:space="preserve">Several previous studies have explored the effectiveness of HTM in predictive learning and anomaly detection, demonstrating its ability to model temporal sequences and recognize patterns with minimal supervision. Additionally, K-Nearest </w:t>
+      </w:r>
+      <w:proofErr w:type="spellStart"/>
+      <w:r>
+        <w:t>Neighbors</w:t>
+      </w:r>
+      <w:proofErr w:type="spellEnd"/>
+      <w:r>
+        <w:t xml:space="preserve"> (KNN) has been widely applied in classification and regression tasks due to its simplicity and effectiveness in pattern recognition [Fix &amp; Hodges, 1951]. However, research on using HTM and KNN for input reconstruction remains relatively unexplored, motivating this study.</w:t>
+      </w:r>
+    </w:p>
+    <w:p>
+      <w:r>
+        <w:lastRenderedPageBreak/>
+        <w:t xml:space="preserve">In this research, we investigate the ability of HTM and KNN classifiers to reconstruct input data from encoded SDR representations. We utilize the </w:t>
+      </w:r>
+      <w:proofErr w:type="spellStart"/>
+      <w:r>
+        <w:t>NeocortexAPI</w:t>
+      </w:r>
+      <w:proofErr w:type="spellEnd"/>
+      <w:r>
+        <w:t xml:space="preserve"> repository to encode input arrays and train a spatial pooler, which learns stable SDR representations from raw data. The dataset is randomized and split into 80% training and 20% testing subsets. Both classifiers are trained on the first 80% and later tested on the remaining 20% using encoded values for decoding. To evaluate reconstruction accuracy, we introduce two similarity metrics:</w:t>
+      </w:r>
+    </w:p>
+    <w:p>
       <w:pPr>
         <w:numPr>
           <w:ilvl w:val="0"/>
-          <w:numId w:val="1"/>
-        </w:numPr>
-      </w:pPr>
-      <w:r>
-        <w:rPr>
-          <w:b/>
-          <w:bCs/>
-        </w:rPr>
-        <w:t>Background</w:t>
-      </w:r>
-      <w:r>
-        <w:t>:</w:t>
-      </w:r>
-    </w:p>
-    <w:p>
-      <w:pPr>
-        <w:numPr>
-          <w:ilvl w:val="1"/>
-          <w:numId w:val="1"/>
-        </w:numPr>
-      </w:pPr>
-      <w:r>
-        <w:t>Introduce Hierarchical Temporal Memory (HTM) and its applications in machine learning.</w:t>
-      </w:r>
-    </w:p>
-    <w:p>
-      <w:pPr>
-        <w:numPr>
-          <w:ilvl w:val="1"/>
-          <w:numId w:val="1"/>
-        </w:numPr>
-      </w:pPr>
-      <w:r>
-        <w:t>Discuss the importance of input reconstruction in pattern recognition and anomaly detection.</w:t>
-      </w:r>
-    </w:p>
-    <w:p>
-      <w:pPr>
-        <w:numPr>
-          <w:ilvl w:val="1"/>
-          <w:numId w:val="1"/>
-        </w:numPr>
-      </w:pPr>
-      <w:r>
-        <w:t xml:space="preserve">Mention the role of classifiers like </w:t>
+          <w:numId w:val="14"/>
+        </w:numPr>
+      </w:pPr>
+      <w:r>
+        <w:t>Internal similarity – Measures the alignment between classifier-predicted values and encoded representations.</w:t>
+      </w:r>
+    </w:p>
+    <w:p>
+      <w:pPr>
+        <w:numPr>
+          <w:ilvl w:val="0"/>
+          <w:numId w:val="14"/>
+        </w:numPr>
+      </w:pPr>
+      <w:r>
+        <w:t>Percentage similarity – Quantifies the accuracy of reconstruction relative to the original input.</w:t>
+      </w:r>
+    </w:p>
+    <w:p>
+      <w:r>
+        <w:t xml:space="preserve">We use the </w:t>
       </w:r>
       <w:proofErr w:type="spellStart"/>
       <w:r>
-        <w:t>HTMClassifier</w:t>
+        <w:t>ScottPlot</w:t>
       </w:r>
       <w:proofErr w:type="spellEnd"/>
       <w:r>
-        <w:t xml:space="preserve"> and </w:t>
+        <w:t xml:space="preserve"> library in .NET for visualization, allowing for a clear comparison between original and reconstructed data [</w:t>
       </w:r>
       <w:proofErr w:type="spellStart"/>
       <w:r>
-        <w:t>KNNClassifier</w:t>
+        <w:fldChar w:fldCharType="begin"/>
+      </w:r>
+      <w:r>
+        <w:instrText>HYPERLINK "https://scottplot.net/" \t "_new"</w:instrText>
+      </w:r>
+      <w:r>
+        <w:fldChar w:fldCharType="separate"/>
+      </w:r>
+      <w:r>
+        <w:rPr>
+          <w:rStyle w:val="Hyperlink"/>
+        </w:rPr>
+        <w:t>ScottPlot</w:t>
       </w:r>
       <w:proofErr w:type="spellEnd"/>
       <w:r>
-        <w:t xml:space="preserve"> in reconstructing inputs from Sparse Distributed Representations (SDRs).</w:t>
-      </w:r>
-    </w:p>
-    <w:p>
-      <w:pPr>
-        <w:numPr>
-          <w:ilvl w:val="0"/>
-          <w:numId w:val="1"/>
-        </w:numPr>
-      </w:pPr>
-      <w:r>
-        <w:rPr>
-          <w:b/>
-          <w:bCs/>
-        </w:rPr>
-        <w:t>Problem Statement</w:t>
-      </w:r>
-      <w:r>
-        <w:t>:</w:t>
-      </w:r>
-    </w:p>
-    <w:p>
-      <w:pPr>
-        <w:numPr>
-          <w:ilvl w:val="1"/>
-          <w:numId w:val="1"/>
-        </w:numPr>
-      </w:pPr>
-      <w:r>
-        <w:t>Explain the challenge of accurately reconstructing inputs from encoded SDRs and the need for effective classifiers.</w:t>
-      </w:r>
-    </w:p>
-    <w:p>
-      <w:pPr>
-        <w:numPr>
-          <w:ilvl w:val="0"/>
-          <w:numId w:val="1"/>
-        </w:numPr>
-      </w:pPr>
-      <w:r>
-        <w:rPr>
-          <w:b/>
-          <w:bCs/>
-        </w:rPr>
-        <w:t>Objectives</w:t>
-      </w:r>
-      <w:r>
-        <w:t>:</w:t>
-      </w:r>
-    </w:p>
-    <w:p>
-      <w:pPr>
-        <w:numPr>
-          <w:ilvl w:val="1"/>
-          <w:numId w:val="1"/>
-        </w:numPr>
-      </w:pPr>
-      <w:r>
-        <w:lastRenderedPageBreak/>
-        <w:t xml:space="preserve">Compare the performance of </w:t>
+        <w:rPr>
+          <w:rStyle w:val="Hyperlink"/>
+        </w:rPr>
+        <w:t xml:space="preserve"> Documentation</w:t>
+      </w:r>
+      <w:r>
+        <w:fldChar w:fldCharType="end"/>
+      </w:r>
+      <w:r>
+        <w:t xml:space="preserve">]. Our study aims to demonstrate the effectiveness of SDR-based learning systems for input reconstruction, providing insights into their potential applications in data recovery, anomaly detection, and predictive </w:t>
       </w:r>
       <w:proofErr w:type="spellStart"/>
       <w:r>
-        <w:t>HTMClassifier</w:t>
+        <w:t>modeling</w:t>
       </w:r>
       <w:proofErr w:type="spellEnd"/>
       <w:r>
-        <w:t xml:space="preserve"> and </w:t>
-      </w:r>
-      <w:proofErr w:type="spellStart"/>
-      <w:r>
-        <w:t>KNNClassifier</w:t>
-      </w:r>
-      <w:proofErr w:type="spellEnd"/>
-      <w:r>
-        <w:t xml:space="preserve"> in reconstructing scalar inputs.</w:t>
-      </w:r>
-    </w:p>
-    <w:p>
-      <w:pPr>
-        <w:numPr>
-          <w:ilvl w:val="1"/>
-          <w:numId w:val="1"/>
-        </w:numPr>
-      </w:pPr>
-      <w:r>
-        <w:t>Evaluate the accuracy and efficiency of both classifiers using similarity metrics.</w:t>
-      </w:r>
-    </w:p>
-    <w:p>
-      <w:pPr>
-        <w:numPr>
-          <w:ilvl w:val="0"/>
-          <w:numId w:val="1"/>
-        </w:numPr>
-      </w:pPr>
-      <w:r>
-        <w:rPr>
-          <w:b/>
-          <w:bCs/>
-        </w:rPr>
-        <w:t>Contributions</w:t>
-      </w:r>
-      <w:r>
-        <w:t>:</w:t>
-      </w:r>
-    </w:p>
-    <w:p>
-      <w:pPr>
-        <w:numPr>
-          <w:ilvl w:val="1"/>
-          <w:numId w:val="1"/>
-        </w:numPr>
-      </w:pPr>
-      <w:r>
-        <w:t>Highlight the key contributions of your research, such as the implementation of a scalable input reconstruction pipeline and the comparative analysis of classifiers.</w:t>
-      </w:r>
-    </w:p>
-    <w:p>
-      <w:r>
-        <w:pict w14:anchorId="06AA343D">
-          <v:rect id="_x0000_i1074" style="width:0;height:.75pt" o:hralign="center" o:hrstd="t" o:hrnoshade="t" o:hr="t" fillcolor="#f8faff" stroked="f"/>
+        <w:t>. The findings contribute to the advancement of bio-inspired machine learning techniques and highlight the role of SDR-based classification in solving real-world problems.</w:t>
+      </w:r>
+    </w:p>
+    <w:p>
+      <w:pPr>
+        <w:rPr>
+          <w:b/>
+          <w:bCs/>
+        </w:rPr>
+      </w:pPr>
+      <w:r>
+        <w:rPr>
+          <w:b/>
+          <w:bCs/>
+        </w:rPr>
+        <w:pict w14:anchorId="04BE5D0A">
+          <v:rect id="_x0000_i1089" style="width:0;height:1.5pt" o:hralign="center" o:hrstd="t" o:hr="t" fillcolor="#a0a0a0" stroked="f"/>
         </w:pict>
       </w:r>
     </w:p>
@@ -648,6 +574,7 @@
           <w:b/>
           <w:bCs/>
         </w:rPr>
+        <w:lastRenderedPageBreak/>
         <w:t>3.4. Classification and Reconstruction</w:t>
       </w:r>
     </w:p>
@@ -736,7 +663,6 @@
     </w:p>
     <w:p>
       <w:r>
-        <w:lastRenderedPageBreak/>
         <w:pict w14:anchorId="623E5447">
           <v:rect id="_x0000_i1076" style="width:0;height:.75pt" o:hralign="center" o:hrstd="t" o:hrnoshade="t" o:hr="t" fillcolor="#f8faff" stroked="f"/>
         </w:pict>
@@ -1080,6 +1006,7 @@
           <w:b/>
           <w:bCs/>
         </w:rPr>
+        <w:lastRenderedPageBreak/>
         <w:t>6. Conclusion and Future Work</w:t>
       </w:r>
     </w:p>
@@ -1160,7 +1087,6 @@
         </w:numPr>
       </w:pPr>
       <w:r>
-        <w:lastRenderedPageBreak/>
         <w:t>Exploring other classifiers or hybrid approaches.</w:t>
       </w:r>
     </w:p>
@@ -1205,55 +1131,157 @@
           <w:b/>
           <w:bCs/>
         </w:rPr>
-        <w:t>7. References</w:t>
-      </w:r>
-    </w:p>
-    <w:p>
-      <w:pPr>
-        <w:pStyle w:val="ListParagraph"/>
+        <w:t xml:space="preserve">7. </w:t>
+      </w:r>
+      <w:r>
+        <w:rPr>
+          <w:b/>
+          <w:bCs/>
+        </w:rPr>
+        <w:t>References</w:t>
+      </w:r>
+    </w:p>
+    <w:p>
+      <w:pPr>
         <w:numPr>
           <w:ilvl w:val="0"/>
-          <w:numId w:val="13"/>
-        </w:numPr>
-      </w:pPr>
-      <w:r>
-        <w:rPr>
-          <w:b/>
-          <w:bCs/>
-        </w:rPr>
-        <w:t>Hawkins, J., Ahmad, S., &amp; Cui, Y. (2017).</w:t>
-      </w:r>
-      <w:r>
-        <w:t xml:space="preserve"> A theory of how columns in the neocortex enable learning the structure of the world. </w:t>
-      </w:r>
-      <w:r>
-        <w:rPr>
+          <w:numId w:val="15"/>
+        </w:numPr>
+        <w:rPr>
+          <w:b/>
+          <w:bCs/>
+        </w:rPr>
+      </w:pPr>
+      <w:r>
+        <w:rPr>
+          <w:b/>
+          <w:bCs/>
+        </w:rPr>
+        <w:t xml:space="preserve">Hawkins, J., Ahmad, S., &amp; Cui, Y. (2017). A theory of how columns in the neocortex enable learning the structure of the world. </w:t>
+      </w:r>
+      <w:r>
+        <w:rPr>
+          <w:b/>
+          <w:bCs/>
           <w:i/>
           <w:iCs/>
         </w:rPr>
         <w:t>Frontiers in Neural Circuits, 11</w:t>
       </w:r>
       <w:r>
+        <w:rPr>
+          <w:b/>
+          <w:bCs/>
+        </w:rPr>
         <w:t xml:space="preserve">, 81. </w:t>
       </w:r>
       <w:hyperlink r:id="rId5" w:history="1">
         <w:r>
           <w:rPr>
             <w:rStyle w:val="Hyperlink"/>
+            <w:b/>
+            <w:bCs/>
           </w:rPr>
-          <w:t>https://www.frontiersin.org/articles/10.3389</w:t>
+          <w:t>https://www.frontiersin.org/articles/10.3389/fncir.2017.00081/full</w:t>
+        </w:r>
+      </w:hyperlink>
+    </w:p>
+    <w:p>
+      <w:pPr>
+        <w:numPr>
+          <w:ilvl w:val="0"/>
+          <w:numId w:val="15"/>
+        </w:numPr>
+        <w:rPr>
+          <w:b/>
+          <w:bCs/>
+        </w:rPr>
+      </w:pPr>
+      <w:r>
+        <w:rPr>
+          <w:b/>
+          <w:bCs/>
+        </w:rPr>
+        <w:t xml:space="preserve">Fix, E., &amp; Hodges, J. L. (1951). Discriminatory analysis: Nonparametric discrimination: Consistency properties. </w:t>
+      </w:r>
+      <w:r>
+        <w:rPr>
+          <w:b/>
+          <w:bCs/>
+          <w:i/>
+          <w:iCs/>
+        </w:rPr>
+        <w:t>USA Air Force School of Aviation Medicine</w:t>
+      </w:r>
+      <w:r>
+        <w:rPr>
+          <w:b/>
+          <w:bCs/>
+        </w:rPr>
+        <w:t xml:space="preserve">. </w:t>
+      </w:r>
+      <w:hyperlink r:id="rId6" w:history="1">
+        <w:r>
+          <w:rPr>
+            <w:rStyle w:val="Hyperlink"/>
+            <w:b/>
+            <w:bCs/>
+          </w:rPr>
+          <w:t>https://apps.dtic.mil/sti/ci</w:t>
         </w:r>
         <w:r>
           <w:rPr>
             <w:rStyle w:val="Hyperlink"/>
+            <w:b/>
+            <w:bCs/>
           </w:rPr>
-          <w:t>/</w:t>
+          <w:t>t</w:t>
         </w:r>
         <w:r>
           <w:rPr>
             <w:rStyle w:val="Hyperlink"/>
+            <w:b/>
+            <w:bCs/>
           </w:rPr>
-          <w:t>fncir.2017.00081/full</w:t>
+          <w:t>ations/AD0246147</w:t>
+        </w:r>
+      </w:hyperlink>
+    </w:p>
+    <w:p>
+      <w:pPr>
+        <w:numPr>
+          <w:ilvl w:val="0"/>
+          <w:numId w:val="15"/>
+        </w:numPr>
+        <w:rPr>
+          <w:b/>
+          <w:bCs/>
+        </w:rPr>
+      </w:pPr>
+      <w:proofErr w:type="spellStart"/>
+      <w:r>
+        <w:rPr>
+          <w:b/>
+          <w:bCs/>
+        </w:rPr>
+        <w:t>ScottPlot</w:t>
+      </w:r>
+      <w:proofErr w:type="spellEnd"/>
+      <w:r>
+        <w:rPr>
+          <w:b/>
+          <w:bCs/>
+        </w:rPr>
+        <w:t xml:space="preserve"> Library Documentation. (n.d.). A .NET library for interactive data visualization. </w:t>
+      </w:r>
+      <w:hyperlink r:id="rId7" w:tgtFrame="_new" w:history="1">
+        <w:r>
+          <w:rPr>
+            <w:rStyle w:val="Hyperlink"/>
+            <w:b/>
+            <w:bCs/>
+          </w:rPr>
+          <w:t>https://scottplot.net/</w:t>
         </w:r>
       </w:hyperlink>
       <w:r>
@@ -2837,6 +2865,119 @@
     </w:lvl>
   </w:abstractNum>
   <w:abstractNum w:abstractNumId="10" w15:restartNumberingAfterBreak="0">
+    <w:nsid w:val="505F0FB5"/>
+    <w:multiLevelType w:val="multilevel"/>
+    <w:tmpl w:val="9966776C"/>
+    <w:lvl w:ilvl="0">
+      <w:start w:val="1"/>
+      <w:numFmt w:val="decimal"/>
+      <w:lvlText w:val="%1."/>
+      <w:lvlJc w:val="left"/>
+      <w:pPr>
+        <w:tabs>
+          <w:tab w:val="num" w:pos="720"/>
+        </w:tabs>
+        <w:ind w:left="720" w:hanging="360"/>
+      </w:pPr>
+    </w:lvl>
+    <w:lvl w:ilvl="1" w:tentative="1">
+      <w:start w:val="1"/>
+      <w:numFmt w:val="decimal"/>
+      <w:lvlText w:val="%2."/>
+      <w:lvlJc w:val="left"/>
+      <w:pPr>
+        <w:tabs>
+          <w:tab w:val="num" w:pos="1440"/>
+        </w:tabs>
+        <w:ind w:left="1440" w:hanging="360"/>
+      </w:pPr>
+    </w:lvl>
+    <w:lvl w:ilvl="2" w:tentative="1">
+      <w:start w:val="1"/>
+      <w:numFmt w:val="decimal"/>
+      <w:lvlText w:val="%3."/>
+      <w:lvlJc w:val="left"/>
+      <w:pPr>
+        <w:tabs>
+          <w:tab w:val="num" w:pos="2160"/>
+        </w:tabs>
+        <w:ind w:left="2160" w:hanging="360"/>
+      </w:pPr>
+    </w:lvl>
+    <w:lvl w:ilvl="3" w:tentative="1">
+      <w:start w:val="1"/>
+      <w:numFmt w:val="decimal"/>
+      <w:lvlText w:val="%4."/>
+      <w:lvlJc w:val="left"/>
+      <w:pPr>
+        <w:tabs>
+          <w:tab w:val="num" w:pos="2880"/>
+        </w:tabs>
+        <w:ind w:left="2880" w:hanging="360"/>
+      </w:pPr>
+    </w:lvl>
+    <w:lvl w:ilvl="4" w:tentative="1">
+      <w:start w:val="1"/>
+      <w:numFmt w:val="decimal"/>
+      <w:lvlText w:val="%5."/>
+      <w:lvlJc w:val="left"/>
+      <w:pPr>
+        <w:tabs>
+          <w:tab w:val="num" w:pos="3600"/>
+        </w:tabs>
+        <w:ind w:left="3600" w:hanging="360"/>
+      </w:pPr>
+    </w:lvl>
+    <w:lvl w:ilvl="5" w:tentative="1">
+      <w:start w:val="1"/>
+      <w:numFmt w:val="decimal"/>
+      <w:lvlText w:val="%6."/>
+      <w:lvlJc w:val="left"/>
+      <w:pPr>
+        <w:tabs>
+          <w:tab w:val="num" w:pos="4320"/>
+        </w:tabs>
+        <w:ind w:left="4320" w:hanging="360"/>
+      </w:pPr>
+    </w:lvl>
+    <w:lvl w:ilvl="6" w:tentative="1">
+      <w:start w:val="1"/>
+      <w:numFmt w:val="decimal"/>
+      <w:lvlText w:val="%7."/>
+      <w:lvlJc w:val="left"/>
+      <w:pPr>
+        <w:tabs>
+          <w:tab w:val="num" w:pos="5040"/>
+        </w:tabs>
+        <w:ind w:left="5040" w:hanging="360"/>
+      </w:pPr>
+    </w:lvl>
+    <w:lvl w:ilvl="7" w:tentative="1">
+      <w:start w:val="1"/>
+      <w:numFmt w:val="decimal"/>
+      <w:lvlText w:val="%8."/>
+      <w:lvlJc w:val="left"/>
+      <w:pPr>
+        <w:tabs>
+          <w:tab w:val="num" w:pos="5760"/>
+        </w:tabs>
+        <w:ind w:left="5760" w:hanging="360"/>
+      </w:pPr>
+    </w:lvl>
+    <w:lvl w:ilvl="8" w:tentative="1">
+      <w:start w:val="1"/>
+      <w:numFmt w:val="decimal"/>
+      <w:lvlText w:val="%9."/>
+      <w:lvlJc w:val="left"/>
+      <w:pPr>
+        <w:tabs>
+          <w:tab w:val="num" w:pos="6480"/>
+        </w:tabs>
+        <w:ind w:left="6480" w:hanging="360"/>
+      </w:pPr>
+    </w:lvl>
+  </w:abstractNum>
+  <w:abstractNum w:abstractNumId="11" w15:restartNumberingAfterBreak="0">
     <w:nsid w:val="69831CDB"/>
     <w:multiLevelType w:val="multilevel"/>
     <w:tmpl w:val="7F28C0D8"/>
@@ -2985,7 +3126,7 @@
       </w:rPr>
     </w:lvl>
   </w:abstractNum>
-  <w:abstractNum w:abstractNumId="11" w15:restartNumberingAfterBreak="0">
+  <w:abstractNum w:abstractNumId="12" w15:restartNumberingAfterBreak="0">
     <w:nsid w:val="6CA374B8"/>
     <w:multiLevelType w:val="hybridMultilevel"/>
     <w:tmpl w:val="25A2FD02"/>
@@ -3098,7 +3239,7 @@
       </w:rPr>
     </w:lvl>
   </w:abstractNum>
-  <w:abstractNum w:abstractNumId="12" w15:restartNumberingAfterBreak="0">
+  <w:abstractNum w:abstractNumId="13" w15:restartNumberingAfterBreak="0">
     <w:nsid w:val="72AE5927"/>
     <w:multiLevelType w:val="multilevel"/>
     <w:tmpl w:val="F9969016"/>
@@ -3245,13 +3386,126 @@
         <w:rFonts w:ascii="Wingdings" w:hAnsi="Wingdings" w:hint="default"/>
         <w:sz w:val="20"/>
       </w:rPr>
+    </w:lvl>
+  </w:abstractNum>
+  <w:abstractNum w:abstractNumId="14" w15:restartNumberingAfterBreak="0">
+    <w:nsid w:val="7B5C5021"/>
+    <w:multiLevelType w:val="multilevel"/>
+    <w:tmpl w:val="B6C8BA40"/>
+    <w:lvl w:ilvl="0">
+      <w:start w:val="1"/>
+      <w:numFmt w:val="decimal"/>
+      <w:lvlText w:val="%1."/>
+      <w:lvlJc w:val="left"/>
+      <w:pPr>
+        <w:tabs>
+          <w:tab w:val="num" w:pos="720"/>
+        </w:tabs>
+        <w:ind w:left="720" w:hanging="360"/>
+      </w:pPr>
+    </w:lvl>
+    <w:lvl w:ilvl="1" w:tentative="1">
+      <w:start w:val="1"/>
+      <w:numFmt w:val="decimal"/>
+      <w:lvlText w:val="%2."/>
+      <w:lvlJc w:val="left"/>
+      <w:pPr>
+        <w:tabs>
+          <w:tab w:val="num" w:pos="1440"/>
+        </w:tabs>
+        <w:ind w:left="1440" w:hanging="360"/>
+      </w:pPr>
+    </w:lvl>
+    <w:lvl w:ilvl="2" w:tentative="1">
+      <w:start w:val="1"/>
+      <w:numFmt w:val="decimal"/>
+      <w:lvlText w:val="%3."/>
+      <w:lvlJc w:val="left"/>
+      <w:pPr>
+        <w:tabs>
+          <w:tab w:val="num" w:pos="2160"/>
+        </w:tabs>
+        <w:ind w:left="2160" w:hanging="360"/>
+      </w:pPr>
+    </w:lvl>
+    <w:lvl w:ilvl="3" w:tentative="1">
+      <w:start w:val="1"/>
+      <w:numFmt w:val="decimal"/>
+      <w:lvlText w:val="%4."/>
+      <w:lvlJc w:val="left"/>
+      <w:pPr>
+        <w:tabs>
+          <w:tab w:val="num" w:pos="2880"/>
+        </w:tabs>
+        <w:ind w:left="2880" w:hanging="360"/>
+      </w:pPr>
+    </w:lvl>
+    <w:lvl w:ilvl="4" w:tentative="1">
+      <w:start w:val="1"/>
+      <w:numFmt w:val="decimal"/>
+      <w:lvlText w:val="%5."/>
+      <w:lvlJc w:val="left"/>
+      <w:pPr>
+        <w:tabs>
+          <w:tab w:val="num" w:pos="3600"/>
+        </w:tabs>
+        <w:ind w:left="3600" w:hanging="360"/>
+      </w:pPr>
+    </w:lvl>
+    <w:lvl w:ilvl="5" w:tentative="1">
+      <w:start w:val="1"/>
+      <w:numFmt w:val="decimal"/>
+      <w:lvlText w:val="%6."/>
+      <w:lvlJc w:val="left"/>
+      <w:pPr>
+        <w:tabs>
+          <w:tab w:val="num" w:pos="4320"/>
+        </w:tabs>
+        <w:ind w:left="4320" w:hanging="360"/>
+      </w:pPr>
+    </w:lvl>
+    <w:lvl w:ilvl="6" w:tentative="1">
+      <w:start w:val="1"/>
+      <w:numFmt w:val="decimal"/>
+      <w:lvlText w:val="%7."/>
+      <w:lvlJc w:val="left"/>
+      <w:pPr>
+        <w:tabs>
+          <w:tab w:val="num" w:pos="5040"/>
+        </w:tabs>
+        <w:ind w:left="5040" w:hanging="360"/>
+      </w:pPr>
+    </w:lvl>
+    <w:lvl w:ilvl="7" w:tentative="1">
+      <w:start w:val="1"/>
+      <w:numFmt w:val="decimal"/>
+      <w:lvlText w:val="%8."/>
+      <w:lvlJc w:val="left"/>
+      <w:pPr>
+        <w:tabs>
+          <w:tab w:val="num" w:pos="5760"/>
+        </w:tabs>
+        <w:ind w:left="5760" w:hanging="360"/>
+      </w:pPr>
+    </w:lvl>
+    <w:lvl w:ilvl="8" w:tentative="1">
+      <w:start w:val="1"/>
+      <w:numFmt w:val="decimal"/>
+      <w:lvlText w:val="%9."/>
+      <w:lvlJc w:val="left"/>
+      <w:pPr>
+        <w:tabs>
+          <w:tab w:val="num" w:pos="6480"/>
+        </w:tabs>
+        <w:ind w:left="6480" w:hanging="360"/>
+      </w:pPr>
     </w:lvl>
   </w:abstractNum>
   <w:num w:numId="1" w16cid:durableId="881597774">
     <w:abstractNumId w:val="1"/>
   </w:num>
   <w:num w:numId="2" w16cid:durableId="1814176032">
-    <w:abstractNumId w:val="10"/>
+    <w:abstractNumId w:val="11"/>
   </w:num>
   <w:num w:numId="3" w16cid:durableId="1316497591">
     <w:abstractNumId w:val="2"/>
@@ -3272,7 +3526,7 @@
     <w:abstractNumId w:val="6"/>
   </w:num>
   <w:num w:numId="9" w16cid:durableId="609974665">
-    <w:abstractNumId w:val="12"/>
+    <w:abstractNumId w:val="13"/>
   </w:num>
   <w:num w:numId="10" w16cid:durableId="1706515745">
     <w:abstractNumId w:val="9"/>
@@ -3284,7 +3538,13 @@
     <w:abstractNumId w:val="4"/>
   </w:num>
   <w:num w:numId="13" w16cid:durableId="451481556">
-    <w:abstractNumId w:val="11"/>
+    <w:abstractNumId w:val="12"/>
+  </w:num>
+  <w:num w:numId="14" w16cid:durableId="1322733555">
+    <w:abstractNumId w:val="14"/>
+  </w:num>
+  <w:num w:numId="15" w16cid:durableId="1816532663">
+    <w:abstractNumId w:val="10"/>
   </w:num>
 </w:numbering>
 </file>

</xml_diff>

<commit_message>
Added result analysis part in research paper
</commit_message>
<xml_diff>
--- a/source/Documentation_Team_Untitled/Team_Untitled _Research_paper.docx
+++ b/source/Documentation_Team_Untitled/Team_Untitled _Research_paper.docx
@@ -13573,21 +13573,481 @@
       <w:pPr>
         <w:jc w:val="both"/>
       </w:pPr>
-    </w:p>
-    <w:p>
-      <w:pPr>
-        <w:jc w:val="both"/>
-      </w:pPr>
-    </w:p>
-    <w:p>
-      <w:pPr>
-        <w:jc w:val="both"/>
-      </w:pPr>
-    </w:p>
-    <w:p>
-      <w:pPr>
-        <w:jc w:val="both"/>
-      </w:pPr>
+      <w:r>
+        <w:t>Result analysis:</w:t>
+      </w:r>
+    </w:p>
+    <w:p>
+      <w:pPr>
+        <w:jc w:val="both"/>
+        <w:rPr>
+          <w:rFonts w:cstheme="minorHAnsi"/>
+          <w:sz w:val="24"/>
+          <w:szCs w:val="24"/>
+        </w:rPr>
+      </w:pPr>
+      <w:r>
+        <w:rPr>
+          <w:rFonts w:cstheme="minorHAnsi"/>
+          <w:sz w:val="24"/>
+          <w:szCs w:val="24"/>
+        </w:rPr>
+        <w:t xml:space="preserve">This section presents the experimental results of input reconstruction using </w:t>
+      </w:r>
+      <w:proofErr w:type="spellStart"/>
+      <w:r>
+        <w:rPr>
+          <w:rFonts w:cstheme="minorHAnsi"/>
+          <w:sz w:val="24"/>
+          <w:szCs w:val="24"/>
+        </w:rPr>
+        <w:t>HTMClassifier</w:t>
+      </w:r>
+      <w:proofErr w:type="spellEnd"/>
+      <w:r>
+        <w:rPr>
+          <w:rFonts w:cstheme="minorHAnsi"/>
+          <w:sz w:val="24"/>
+          <w:szCs w:val="24"/>
+        </w:rPr>
+        <w:t xml:space="preserve"> and </w:t>
+      </w:r>
+      <w:proofErr w:type="spellStart"/>
+      <w:r>
+        <w:rPr>
+          <w:rFonts w:cstheme="minorHAnsi"/>
+          <w:sz w:val="24"/>
+          <w:szCs w:val="24"/>
+        </w:rPr>
+        <w:t>KNNClassifier</w:t>
+      </w:r>
+      <w:proofErr w:type="spellEnd"/>
+      <w:r>
+        <w:rPr>
+          <w:rFonts w:cstheme="minorHAnsi"/>
+          <w:sz w:val="24"/>
+          <w:szCs w:val="24"/>
+        </w:rPr>
+        <w:t>. The evaluation is based on reconstruction accuracy, computational efficiency, and similarity metrics. We also include graphical visualizations of the reconstruction process and provide a discussion of the classifiers’ strengths, weaknesses, and unexpected observations.</w:t>
+      </w:r>
+      <w:r>
+        <w:rPr>
+          <w:rFonts w:cstheme="minorHAnsi"/>
+          <w:sz w:val="24"/>
+          <w:szCs w:val="24"/>
+        </w:rPr>
+        <w:t xml:space="preserve"> We will be discussing three cases where inputs were from 1-20, 1-50 and 1-100.</w:t>
+      </w:r>
+    </w:p>
+    <w:p>
+      <w:pPr>
+        <w:jc w:val="both"/>
+        <w:rPr>
+          <w:rFonts w:cstheme="minorHAnsi"/>
+          <w:sz w:val="24"/>
+          <w:szCs w:val="24"/>
+        </w:rPr>
+      </w:pPr>
+      <w:r>
+        <w:rPr>
+          <w:rFonts w:cstheme="minorHAnsi"/>
+          <w:sz w:val="24"/>
+          <w:szCs w:val="24"/>
+        </w:rPr>
+        <w:t>Case 1: 1-20</w:t>
+      </w:r>
+    </w:p>
+    <w:p>
+      <w:pPr>
+        <w:jc w:val="both"/>
+        <w:rPr>
+          <w:rFonts w:cstheme="minorHAnsi"/>
+          <w:sz w:val="24"/>
+          <w:szCs w:val="24"/>
+        </w:rPr>
+      </w:pPr>
+      <w:r>
+        <w:rPr>
+          <w:rFonts w:cstheme="minorHAnsi"/>
+          <w:noProof/>
+          <w:sz w:val="24"/>
+          <w:szCs w:val="24"/>
+        </w:rPr>
+        <w:lastRenderedPageBreak/>
+        <w:drawing>
+          <wp:inline distT="0" distB="0" distL="0" distR="0" wp14:anchorId="03381056" wp14:editId="4574FBC6">
+            <wp:extent cx="4347264" cy="3916680"/>
+            <wp:effectExtent l="0" t="0" r="0" b="7620"/>
+            <wp:docPr id="1436996235" name="Picture 1"/>
+            <wp:cNvGraphicFramePr>
+              <a:graphicFrameLocks xmlns:a="http://schemas.openxmlformats.org/drawingml/2006/main" noChangeAspect="1"/>
+            </wp:cNvGraphicFramePr>
+            <a:graphic xmlns:a="http://schemas.openxmlformats.org/drawingml/2006/main">
+              <a:graphicData uri="http://schemas.openxmlformats.org/drawingml/2006/picture">
+                <pic:pic xmlns:pic="http://schemas.openxmlformats.org/drawingml/2006/picture">
+                  <pic:nvPicPr>
+                    <pic:cNvPr id="1436996235" name="Picture 1436996235"/>
+                    <pic:cNvPicPr/>
+                  </pic:nvPicPr>
+                  <pic:blipFill>
+                    <a:blip r:embed="rId21">
+                      <a:extLst>
+                        <a:ext uri="{28A0092B-C50C-407E-A947-70E740481C1C}">
+                          <a14:useLocalDpi xmlns:a14="http://schemas.microsoft.com/office/drawing/2010/main" val="0"/>
+                        </a:ext>
+                      </a:extLst>
+                    </a:blip>
+                    <a:stretch>
+                      <a:fillRect/>
+                    </a:stretch>
+                  </pic:blipFill>
+                  <pic:spPr>
+                    <a:xfrm>
+                      <a:off x="0" y="0"/>
+                      <a:ext cx="4350893" cy="3919950"/>
+                    </a:xfrm>
+                    <a:prstGeom prst="rect">
+                      <a:avLst/>
+                    </a:prstGeom>
+                  </pic:spPr>
+                </pic:pic>
+              </a:graphicData>
+            </a:graphic>
+          </wp:inline>
+        </w:drawing>
+      </w:r>
+    </w:p>
+    <w:p>
+      <w:pPr>
+        <w:jc w:val="both"/>
+      </w:pPr>
+      <w:r>
+        <w:t xml:space="preserve">The above image represents the reconstruction of HTM Classifier for input values till 20. We mentioned earlier that we divided the input set into </w:t>
+      </w:r>
+      <w:proofErr w:type="gramStart"/>
+      <w:r>
+        <w:t>a</w:t>
+      </w:r>
+      <w:proofErr w:type="gramEnd"/>
+      <w:r>
+        <w:t xml:space="preserve"> 80% and 20% split. This image represents the reconstruction part of the 20% split. IF you closely notice, the HTM did reconstruct the inputs with good accuracy but </w:t>
+      </w:r>
+      <w:proofErr w:type="spellStart"/>
+      <w:r>
+        <w:t>its</w:t>
+      </w:r>
+      <w:proofErr w:type="spellEnd"/>
+      <w:r>
+        <w:t xml:space="preserve"> not perfect. Same goes for the graph below which is for the KNN Classifier.</w:t>
+      </w:r>
+    </w:p>
+    <w:p>
+      <w:pPr>
+        <w:jc w:val="both"/>
+      </w:pPr>
+      <w:r>
+        <w:rPr>
+          <w:noProof/>
+        </w:rPr>
+        <w:drawing>
+          <wp:inline distT="0" distB="0" distL="0" distR="0" wp14:anchorId="29D23DFA" wp14:editId="1822CCE0">
+            <wp:extent cx="2080598" cy="1874520"/>
+            <wp:effectExtent l="0" t="0" r="0" b="0"/>
+            <wp:docPr id="63084094" name="Picture 2"/>
+            <wp:cNvGraphicFramePr>
+              <a:graphicFrameLocks xmlns:a="http://schemas.openxmlformats.org/drawingml/2006/main" noChangeAspect="1"/>
+            </wp:cNvGraphicFramePr>
+            <a:graphic xmlns:a="http://schemas.openxmlformats.org/drawingml/2006/main">
+              <a:graphicData uri="http://schemas.openxmlformats.org/drawingml/2006/picture">
+                <pic:pic xmlns:pic="http://schemas.openxmlformats.org/drawingml/2006/picture">
+                  <pic:nvPicPr>
+                    <pic:cNvPr id="63084094" name="Picture 63084094"/>
+                    <pic:cNvPicPr/>
+                  </pic:nvPicPr>
+                  <pic:blipFill>
+                    <a:blip r:embed="rId22" cstate="print">
+                      <a:extLst>
+                        <a:ext uri="{28A0092B-C50C-407E-A947-70E740481C1C}">
+                          <a14:useLocalDpi xmlns:a14="http://schemas.microsoft.com/office/drawing/2010/main" val="0"/>
+                        </a:ext>
+                      </a:extLst>
+                    </a:blip>
+                    <a:stretch>
+                      <a:fillRect/>
+                    </a:stretch>
+                  </pic:blipFill>
+                  <pic:spPr>
+                    <a:xfrm>
+                      <a:off x="0" y="0"/>
+                      <a:ext cx="2082123" cy="1875894"/>
+                    </a:xfrm>
+                    <a:prstGeom prst="rect">
+                      <a:avLst/>
+                    </a:prstGeom>
+                  </pic:spPr>
+                </pic:pic>
+              </a:graphicData>
+            </a:graphic>
+          </wp:inline>
+        </w:drawing>
+      </w:r>
+    </w:p>
+    <w:p>
+      <w:pPr>
+        <w:jc w:val="both"/>
+      </w:pPr>
+    </w:p>
+    <w:p>
+      <w:pPr>
+        <w:jc w:val="both"/>
+      </w:pPr>
+      <w:r>
+        <w:t xml:space="preserve">Now </w:t>
+      </w:r>
+      <w:proofErr w:type="gramStart"/>
+      <w:r>
+        <w:t>lets</w:t>
+      </w:r>
+      <w:proofErr w:type="gramEnd"/>
+      <w:r>
+        <w:t xml:space="preserve"> look at the percentage similarity comparison between both the classifiers.</w:t>
+      </w:r>
+    </w:p>
+    <w:p>
+      <w:pPr>
+        <w:jc w:val="both"/>
+      </w:pPr>
+      <w:r>
+        <w:rPr>
+          <w:noProof/>
+        </w:rPr>
+        <w:lastRenderedPageBreak/>
+        <w:drawing>
+          <wp:inline distT="0" distB="0" distL="0" distR="0" wp14:anchorId="546715F2" wp14:editId="0BACB7E2">
+            <wp:extent cx="4245772" cy="3825240"/>
+            <wp:effectExtent l="0" t="0" r="2540" b="3810"/>
+            <wp:docPr id="1998750757" name="Picture 3"/>
+            <wp:cNvGraphicFramePr>
+              <a:graphicFrameLocks xmlns:a="http://schemas.openxmlformats.org/drawingml/2006/main" noChangeAspect="1"/>
+            </wp:cNvGraphicFramePr>
+            <a:graphic xmlns:a="http://schemas.openxmlformats.org/drawingml/2006/main">
+              <a:graphicData uri="http://schemas.openxmlformats.org/drawingml/2006/picture">
+                <pic:pic xmlns:pic="http://schemas.openxmlformats.org/drawingml/2006/picture">
+                  <pic:nvPicPr>
+                    <pic:cNvPr id="1998750757" name="Picture 1998750757"/>
+                    <pic:cNvPicPr/>
+                  </pic:nvPicPr>
+                  <pic:blipFill>
+                    <a:blip r:embed="rId23">
+                      <a:extLst>
+                        <a:ext uri="{28A0092B-C50C-407E-A947-70E740481C1C}">
+                          <a14:useLocalDpi xmlns:a14="http://schemas.microsoft.com/office/drawing/2010/main" val="0"/>
+                        </a:ext>
+                      </a:extLst>
+                    </a:blip>
+                    <a:stretch>
+                      <a:fillRect/>
+                    </a:stretch>
+                  </pic:blipFill>
+                  <pic:spPr>
+                    <a:xfrm>
+                      <a:off x="0" y="0"/>
+                      <a:ext cx="4248287" cy="3827506"/>
+                    </a:xfrm>
+                    <a:prstGeom prst="rect">
+                      <a:avLst/>
+                    </a:prstGeom>
+                  </pic:spPr>
+                </pic:pic>
+              </a:graphicData>
+            </a:graphic>
+          </wp:inline>
+        </w:drawing>
+      </w:r>
+    </w:p>
+    <w:p>
+      <w:pPr>
+        <w:jc w:val="both"/>
+      </w:pPr>
+      <w:r>
+        <w:t xml:space="preserve">From the above similarity </w:t>
+      </w:r>
+      <w:proofErr w:type="gramStart"/>
+      <w:r>
+        <w:t>graph</w:t>
+      </w:r>
+      <w:proofErr w:type="gramEnd"/>
+      <w:r>
+        <w:t xml:space="preserve"> we can clearly notice that HTM performed a little better in some of the inputs.</w:t>
+      </w:r>
+    </w:p>
+    <w:p>
+      <w:pPr>
+        <w:jc w:val="both"/>
+      </w:pPr>
+    </w:p>
+    <w:p>
+      <w:pPr>
+        <w:jc w:val="both"/>
+      </w:pPr>
+      <w:r>
+        <w:t xml:space="preserve">Now </w:t>
+      </w:r>
+      <w:proofErr w:type="gramStart"/>
+      <w:r>
+        <w:t>lets</w:t>
+      </w:r>
+      <w:proofErr w:type="gramEnd"/>
+      <w:r>
+        <w:t xml:space="preserve"> look at a conjugation, what would have happened if we try the reconstruction on the training data itself. For the below graphs </w:t>
+      </w:r>
+      <w:r>
+        <w:t>it is clearly evident that both the classifiers are able to reconstruct all the inputs perfectly with 100% similarity.</w:t>
+      </w:r>
+    </w:p>
+    <w:p>
+      <w:pPr>
+        <w:jc w:val="both"/>
+      </w:pPr>
+      <w:r>
+        <w:rPr>
+          <w:noProof/>
+        </w:rPr>
+        <w:lastRenderedPageBreak/>
+        <w:drawing>
+          <wp:inline distT="0" distB="0" distL="0" distR="0" wp14:anchorId="7311BF0D" wp14:editId="65DE31A1">
+            <wp:extent cx="2697480" cy="2430304"/>
+            <wp:effectExtent l="0" t="0" r="7620" b="8255"/>
+            <wp:docPr id="1075727805" name="Picture 4"/>
+            <wp:cNvGraphicFramePr>
+              <a:graphicFrameLocks xmlns:a="http://schemas.openxmlformats.org/drawingml/2006/main" noChangeAspect="1"/>
+            </wp:cNvGraphicFramePr>
+            <a:graphic xmlns:a="http://schemas.openxmlformats.org/drawingml/2006/main">
+              <a:graphicData uri="http://schemas.openxmlformats.org/drawingml/2006/picture">
+                <pic:pic xmlns:pic="http://schemas.openxmlformats.org/drawingml/2006/picture">
+                  <pic:nvPicPr>
+                    <pic:cNvPr id="1075727805" name="Picture 1075727805"/>
+                    <pic:cNvPicPr/>
+                  </pic:nvPicPr>
+                  <pic:blipFill>
+                    <a:blip r:embed="rId24" cstate="print">
+                      <a:extLst>
+                        <a:ext uri="{28A0092B-C50C-407E-A947-70E740481C1C}">
+                          <a14:useLocalDpi xmlns:a14="http://schemas.microsoft.com/office/drawing/2010/main" val="0"/>
+                        </a:ext>
+                      </a:extLst>
+                    </a:blip>
+                    <a:stretch>
+                      <a:fillRect/>
+                    </a:stretch>
+                  </pic:blipFill>
+                  <pic:spPr>
+                    <a:xfrm>
+                      <a:off x="0" y="0"/>
+                      <a:ext cx="2727951" cy="2457757"/>
+                    </a:xfrm>
+                    <a:prstGeom prst="rect">
+                      <a:avLst/>
+                    </a:prstGeom>
+                  </pic:spPr>
+                </pic:pic>
+              </a:graphicData>
+            </a:graphic>
+          </wp:inline>
+        </w:drawing>
+      </w:r>
+      <w:r>
+        <w:rPr>
+          <w:noProof/>
+        </w:rPr>
+        <w:drawing>
+          <wp:inline distT="0" distB="0" distL="0" distR="0" wp14:anchorId="5C5E5D96" wp14:editId="1CA7A128">
+            <wp:extent cx="2714926" cy="2446020"/>
+            <wp:effectExtent l="0" t="0" r="9525" b="0"/>
+            <wp:docPr id="663713135" name="Picture 5"/>
+            <wp:cNvGraphicFramePr>
+              <a:graphicFrameLocks xmlns:a="http://schemas.openxmlformats.org/drawingml/2006/main" noChangeAspect="1"/>
+            </wp:cNvGraphicFramePr>
+            <a:graphic xmlns:a="http://schemas.openxmlformats.org/drawingml/2006/main">
+              <a:graphicData uri="http://schemas.openxmlformats.org/drawingml/2006/picture">
+                <pic:pic xmlns:pic="http://schemas.openxmlformats.org/drawingml/2006/picture">
+                  <pic:nvPicPr>
+                    <pic:cNvPr id="663713135" name="Picture 663713135"/>
+                    <pic:cNvPicPr/>
+                  </pic:nvPicPr>
+                  <pic:blipFill>
+                    <a:blip r:embed="rId25" cstate="print">
+                      <a:extLst>
+                        <a:ext uri="{28A0092B-C50C-407E-A947-70E740481C1C}">
+                          <a14:useLocalDpi xmlns:a14="http://schemas.microsoft.com/office/drawing/2010/main" val="0"/>
+                        </a:ext>
+                      </a:extLst>
+                    </a:blip>
+                    <a:stretch>
+                      <a:fillRect/>
+                    </a:stretch>
+                  </pic:blipFill>
+                  <pic:spPr>
+                    <a:xfrm>
+                      <a:off x="0" y="0"/>
+                      <a:ext cx="2724064" cy="2454253"/>
+                    </a:xfrm>
+                    <a:prstGeom prst="rect">
+                      <a:avLst/>
+                    </a:prstGeom>
+                  </pic:spPr>
+                </pic:pic>
+              </a:graphicData>
+            </a:graphic>
+          </wp:inline>
+        </w:drawing>
+      </w:r>
+      <w:r>
+        <w:rPr>
+          <w:noProof/>
+        </w:rPr>
+        <w:drawing>
+          <wp:inline distT="0" distB="0" distL="0" distR="0" wp14:anchorId="06EA73C9" wp14:editId="0C1855FE">
+            <wp:extent cx="2655722" cy="2392680"/>
+            <wp:effectExtent l="0" t="0" r="0" b="7620"/>
+            <wp:docPr id="788067642" name="Picture 6"/>
+            <wp:cNvGraphicFramePr>
+              <a:graphicFrameLocks xmlns:a="http://schemas.openxmlformats.org/drawingml/2006/main" noChangeAspect="1"/>
+            </wp:cNvGraphicFramePr>
+            <a:graphic xmlns:a="http://schemas.openxmlformats.org/drawingml/2006/main">
+              <a:graphicData uri="http://schemas.openxmlformats.org/drawingml/2006/picture">
+                <pic:pic xmlns:pic="http://schemas.openxmlformats.org/drawingml/2006/picture">
+                  <pic:nvPicPr>
+                    <pic:cNvPr id="788067642" name="Picture 788067642"/>
+                    <pic:cNvPicPr/>
+                  </pic:nvPicPr>
+                  <pic:blipFill>
+                    <a:blip r:embed="rId26" cstate="print">
+                      <a:extLst>
+                        <a:ext uri="{28A0092B-C50C-407E-A947-70E740481C1C}">
+                          <a14:useLocalDpi xmlns:a14="http://schemas.microsoft.com/office/drawing/2010/main" val="0"/>
+                        </a:ext>
+                      </a:extLst>
+                    </a:blip>
+                    <a:stretch>
+                      <a:fillRect/>
+                    </a:stretch>
+                  </pic:blipFill>
+                  <pic:spPr>
+                    <a:xfrm>
+                      <a:off x="0" y="0"/>
+                      <a:ext cx="2660813" cy="2397267"/>
+                    </a:xfrm>
+                    <a:prstGeom prst="rect">
+                      <a:avLst/>
+                    </a:prstGeom>
+                  </pic:spPr>
+                </pic:pic>
+              </a:graphicData>
+            </a:graphic>
+          </wp:inline>
+        </w:drawing>
+      </w:r>
     </w:p>
     <w:sectPr>
       <w:pgSz w:w="11906" w:h="16838"/>
@@ -29213,6 +29673,7 @@
   <w:style w:type="character" w:default="1" w:styleId="DefaultParagraphFont">
     <w:name w:val="Default Paragraph Font"/>
     <w:uiPriority w:val="1"/>
+    <w:semiHidden/>
     <w:unhideWhenUsed/>
   </w:style>
   <w:style w:type="table" w:default="1" w:styleId="TableNormal">

</xml_diff>